<commit_message>
docs: finalize internship report for printing
- full-page UML diagrams as page floats (no half-empty pages), cropped margins
- Google Sheets screenshots on light background, annexes without page breaks
- keep section titles with their tables, refreshed LaTeX project, zip and Word file

Co-Authored-By: Claude Sonnet 5.5 <noreply@anthropic.com>
</commit_message>
<xml_diff>
--- a/docs/rapport-stage/Rapport_Stage_AirLiquide_GMAO+.docx
+++ b/docs/rapport-stage/Rapport_Stage_AirLiquide_GMAO+.docx
@@ -4202,7 +4202,7 @@
       <w:r>
         <w:drawing>
           <wp:inline xmlns:a="http://schemas.openxmlformats.org/drawingml/2006/main" xmlns:pic="http://schemas.openxmlformats.org/drawingml/2006/picture">
-            <wp:extent cx="5556923" cy="6300000"/>
+            <wp:extent cx="5580000" cy="6290898"/>
             <wp:docPr id="9" name="Picture 9"/>
             <wp:cNvGraphicFramePr>
               <a:graphicFrameLocks noChangeAspect="1"/>
@@ -4223,7 +4223,7 @@
                   <pic:spPr>
                     <a:xfrm>
                       <a:off x="0" y="0"/>
-                      <a:ext cx="5556923" cy="6300000"/>
+                      <a:ext cx="5580000" cy="6290898"/>
                     </a:xfrm>
                     <a:prstGeom prst="rect"/>
                   </pic:spPr>
@@ -4440,7 +4440,7 @@
       <w:r>
         <w:drawing>
           <wp:inline xmlns:a="http://schemas.openxmlformats.org/drawingml/2006/main" xmlns:pic="http://schemas.openxmlformats.org/drawingml/2006/picture">
-            <wp:extent cx="5580000" cy="5839535"/>
+            <wp:extent cx="4924250" cy="6299998"/>
             <wp:docPr id="10" name="Picture 10"/>
             <wp:cNvGraphicFramePr>
               <a:graphicFrameLocks noChangeAspect="1"/>
@@ -4461,7 +4461,7 @@
                   <pic:spPr>
                     <a:xfrm>
                       <a:off x="0" y="0"/>
-                      <a:ext cx="5580000" cy="5839535"/>
+                      <a:ext cx="4924250" cy="6299998"/>
                     </a:xfrm>
                     <a:prstGeom prst="rect"/>
                   </pic:spPr>
@@ -5196,7 +5196,7 @@
       <w:r>
         <w:drawing>
           <wp:inline xmlns:a="http://schemas.openxmlformats.org/drawingml/2006/main" xmlns:pic="http://schemas.openxmlformats.org/drawingml/2006/picture">
-            <wp:extent cx="5580000" cy="5385349"/>
+            <wp:extent cx="5580000" cy="5461042"/>
             <wp:docPr id="11" name="Picture 11"/>
             <wp:cNvGraphicFramePr>
               <a:graphicFrameLocks noChangeAspect="1"/>
@@ -5217,7 +5217,7 @@
                   <pic:spPr>
                     <a:xfrm>
                       <a:off x="0" y="0"/>
-                      <a:ext cx="5580000" cy="5385349"/>
+                      <a:ext cx="5580000" cy="5461042"/>
                     </a:xfrm>
                     <a:prstGeom prst="rect"/>
                   </pic:spPr>
@@ -5263,7 +5263,7 @@
       <w:r>
         <w:drawing>
           <wp:inline xmlns:a="http://schemas.openxmlformats.org/drawingml/2006/main" xmlns:pic="http://schemas.openxmlformats.org/drawingml/2006/picture">
-            <wp:extent cx="5580000" cy="5288023"/>
+            <wp:extent cx="5580000" cy="5264233"/>
             <wp:docPr id="12" name="Picture 12"/>
             <wp:cNvGraphicFramePr>
               <a:graphicFrameLocks noChangeAspect="1"/>
@@ -5284,7 +5284,7 @@
                   <pic:spPr>
                     <a:xfrm>
                       <a:off x="0" y="0"/>
-                      <a:ext cx="5580000" cy="5288023"/>
+                      <a:ext cx="5580000" cy="5264233"/>
                     </a:xfrm>
                     <a:prstGeom prst="rect"/>
                   </pic:spPr>
@@ -5348,7 +5348,7 @@
       <w:r>
         <w:drawing>
           <wp:inline xmlns:a="http://schemas.openxmlformats.org/drawingml/2006/main" xmlns:pic="http://schemas.openxmlformats.org/drawingml/2006/picture">
-            <wp:extent cx="5580000" cy="4412093"/>
+            <wp:extent cx="5580000" cy="5033531"/>
             <wp:docPr id="13" name="Picture 13"/>
             <wp:cNvGraphicFramePr>
               <a:graphicFrameLocks noChangeAspect="1"/>
@@ -5369,7 +5369,7 @@
                   <pic:spPr>
                     <a:xfrm>
                       <a:off x="0" y="0"/>
-                      <a:ext cx="5580000" cy="4412093"/>
+                      <a:ext cx="5580000" cy="5033531"/>
                     </a:xfrm>
                     <a:prstGeom prst="rect"/>
                   </pic:spPr>
@@ -6058,7 +6058,7 @@
       <w:r>
         <w:drawing>
           <wp:inline xmlns:a="http://schemas.openxmlformats.org/drawingml/2006/main" xmlns:pic="http://schemas.openxmlformats.org/drawingml/2006/picture">
-            <wp:extent cx="5580000" cy="3490744"/>
+            <wp:extent cx="5580000" cy="3445326"/>
             <wp:docPr id="14" name="Picture 14"/>
             <wp:cNvGraphicFramePr>
               <a:graphicFrameLocks noChangeAspect="1"/>
@@ -6079,7 +6079,7 @@
                   <pic:spPr>
                     <a:xfrm>
                       <a:off x="0" y="0"/>
-                      <a:ext cx="5580000" cy="3490744"/>
+                      <a:ext cx="5580000" cy="3445326"/>
                     </a:xfrm>
                     <a:prstGeom prst="rect"/>
                   </pic:spPr>
@@ -6531,7 +6531,7 @@
       <w:r>
         <w:drawing>
           <wp:inline xmlns:a="http://schemas.openxmlformats.org/drawingml/2006/main" xmlns:pic="http://schemas.openxmlformats.org/drawingml/2006/picture">
-            <wp:extent cx="5580000" cy="4554837"/>
+            <wp:extent cx="5580000" cy="4509419"/>
             <wp:docPr id="15" name="Picture 15"/>
             <wp:cNvGraphicFramePr>
               <a:graphicFrameLocks noChangeAspect="1"/>
@@ -6552,7 +6552,7 @@
                   <pic:spPr>
                     <a:xfrm>
                       <a:off x="0" y="0"/>
-                      <a:ext cx="5580000" cy="4554837"/>
+                      <a:ext cx="5580000" cy="4509419"/>
                     </a:xfrm>
                     <a:prstGeom prst="rect"/>
                   </pic:spPr>

</xml_diff>